<commit_message>
Finished table for 'RptInvtPayFees' and filled UI data.
</commit_message>
<xml_diff>
--- a/project/documents/reportletters/RptInvtPayFees.docx
+++ b/project/documents/reportletters/RptInvtPayFees.docx
@@ -55,44 +55,48 @@
           <w:bCs/>
           <w:szCs w:val="20"/>
         </w:rPr>
-        <w:t>&lt;&lt;</w:t>
-      </w:r>
-      <w:proofErr w:type="spellStart"/>
-      <w:r>
+        <w:t>&lt;&lt;WAName&gt;&gt; &lt;&lt;WAPhone&gt;&gt;</w:t>
+      </w:r>
+    </w:p>
+    <w:p>
+      <w:pPr>
+        <w:tabs>
+          <w:tab w:val="right" w:pos="9360"/>
+        </w:tabs>
         <w:rPr>
           <w:b/>
           <w:bCs/>
           <w:szCs w:val="20"/>
         </w:rPr>
-        <w:t>WAName</w:t>
-      </w:r>
-      <w:proofErr w:type="spellEnd"/>
+      </w:pPr>
       <w:r>
         <w:rPr>
           <w:b/>
           <w:bCs/>
           <w:szCs w:val="20"/>
         </w:rPr>
-        <w:t>&gt;&gt; &lt;&lt;</w:t>
-      </w:r>
-      <w:proofErr w:type="spellStart"/>
+        <w:t>&lt;&lt;WAEmail&gt;&gt;</w:t>
+      </w:r>
       <w:r>
         <w:rPr>
           <w:b/>
           <w:bCs/>
           <w:szCs w:val="20"/>
         </w:rPr>
-        <w:t>WAPhone</w:t>
-      </w:r>
-      <w:proofErr w:type="spellEnd"/>
-      <w:r>
+        <w:tab/>
+      </w:r>
+    </w:p>
+    <w:p>
+      <w:pPr>
+        <w:tabs>
+          <w:tab w:val="right" w:pos="9360"/>
+        </w:tabs>
         <w:rPr>
           <w:b/>
           <w:bCs/>
           <w:szCs w:val="20"/>
         </w:rPr>
-        <w:t>&gt;&gt;</w:t>
-      </w:r>
+      </w:pPr>
     </w:p>
     <w:p>
       <w:pPr>
@@ -111,33 +115,122 @@
           <w:bCs/>
           <w:szCs w:val="20"/>
         </w:rPr>
-        <w:t>&lt;&lt;</w:t>
-      </w:r>
-      <w:proofErr w:type="spellStart"/>
+        <w:t>&lt;&lt;paraName&gt;&gt; &lt;&lt;paraPhone&gt;&gt;</w:t>
+      </w:r>
       <w:r>
         <w:rPr>
           <w:b/>
           <w:bCs/>
           <w:szCs w:val="20"/>
         </w:rPr>
-        <w:t>WAEmail</w:t>
-      </w:r>
-      <w:proofErr w:type="spellEnd"/>
+        <w:tab/>
+      </w:r>
+    </w:p>
+    <w:p>
+      <w:pPr>
+        <w:tabs>
+          <w:tab w:val="right" w:pos="9360"/>
+        </w:tabs>
+        <w:rPr>
+          <w:szCs w:val="20"/>
+        </w:rPr>
+      </w:pPr>
       <w:r>
         <w:rPr>
           <w:b/>
           <w:bCs/>
           <w:szCs w:val="20"/>
         </w:rPr>
-        <w:t>&gt;&gt;</w:t>
-      </w:r>
-      <w:r>
+        <w:t>&lt;&lt;paraEmail&gt;&gt;</w:t>
+      </w:r>
+    </w:p>
+    <w:p>
+      <w:pPr>
         <w:rPr>
           <w:b/>
           <w:bCs/>
-          <w:szCs w:val="20"/>
-        </w:rPr>
-        <w:tab/>
+          <w:sz w:val="24"/>
+        </w:rPr>
+      </w:pPr>
+    </w:p>
+    <w:p>
+      <w:pPr>
+        <w:rPr>
+          <w:sz w:val="24"/>
+        </w:rPr>
+      </w:pPr>
+      <w:r>
+        <w:rPr>
+          <w:sz w:val="24"/>
+        </w:rPr>
+        <w:t>&lt;&lt;currentDate&gt;&gt;</w:t>
+      </w:r>
+    </w:p>
+    <w:p>
+      <w:pPr>
+        <w:rPr>
+          <w:sz w:val="24"/>
+        </w:rPr>
+      </w:pPr>
+    </w:p>
+    <w:p>
+      <w:pPr>
+        <w:tabs>
+          <w:tab w:val="left" w:pos="-1440"/>
+        </w:tabs>
+        <w:rPr>
+          <w:sz w:val="24"/>
+        </w:rPr>
+      </w:pPr>
+      <w:r>
+        <w:rPr>
+          <w:sz w:val="24"/>
+        </w:rPr>
+        <w:t>&lt;&lt;recipient&gt;&gt;</w:t>
+      </w:r>
+    </w:p>
+    <w:p>
+      <w:pPr>
+        <w:tabs>
+          <w:tab w:val="left" w:pos="-1440"/>
+        </w:tabs>
+        <w:rPr>
+          <w:sz w:val="24"/>
+        </w:rPr>
+      </w:pPr>
+      <w:r>
+        <w:rPr>
+          <w:sz w:val="24"/>
+        </w:rPr>
+        <w:t>&lt;&lt;</w:t>
+      </w:r>
+      <w:r>
+        <w:rPr>
+          <w:sz w:val="24"/>
+        </w:rPr>
+        <w:t>recipien</w:t>
+      </w:r>
+      <w:r>
+        <w:rPr>
+          <w:sz w:val="24"/>
+        </w:rPr>
+        <w:t>tTitle&gt;&gt;</w:t>
+      </w:r>
+    </w:p>
+    <w:p>
+      <w:pPr>
+        <w:tabs>
+          <w:tab w:val="left" w:pos="-1440"/>
+        </w:tabs>
+        <w:rPr>
+          <w:sz w:val="24"/>
+        </w:rPr>
+      </w:pPr>
+      <w:r>
+        <w:rPr>
+          <w:sz w:val="24"/>
+        </w:rPr>
+        <w:t>&lt;&lt;orgName&gt;&gt;</w:t>
       </w:r>
     </w:p>
     <w:p>
@@ -146,265 +239,14 @@
           <w:tab w:val="right" w:pos="9360"/>
         </w:tabs>
         <w:rPr>
-          <w:b/>
-          <w:bCs/>
-          <w:szCs w:val="20"/>
-        </w:rPr>
-      </w:pPr>
-    </w:p>
-    <w:p>
-      <w:pPr>
-        <w:tabs>
-          <w:tab w:val="right" w:pos="9360"/>
-        </w:tabs>
-        <w:rPr>
-          <w:b/>
-          <w:bCs/>
-          <w:szCs w:val="20"/>
-        </w:rPr>
-      </w:pPr>
-      <w:r>
-        <w:rPr>
-          <w:b/>
-          <w:bCs/>
-          <w:szCs w:val="20"/>
-        </w:rPr>
-        <w:t>&lt;&lt;</w:t>
-      </w:r>
-      <w:proofErr w:type="spellStart"/>
-      <w:r>
-        <w:rPr>
-          <w:b/>
-          <w:bCs/>
-          <w:szCs w:val="20"/>
-        </w:rPr>
-        <w:t>paraName</w:t>
-      </w:r>
-      <w:proofErr w:type="spellEnd"/>
-      <w:r>
-        <w:rPr>
-          <w:b/>
-          <w:bCs/>
-          <w:szCs w:val="20"/>
-        </w:rPr>
-        <w:t>&gt;&gt; &lt;&lt;</w:t>
-      </w:r>
-      <w:proofErr w:type="spellStart"/>
-      <w:r>
-        <w:rPr>
-          <w:b/>
-          <w:bCs/>
-          <w:szCs w:val="20"/>
-        </w:rPr>
-        <w:t>paraPhone</w:t>
-      </w:r>
-      <w:proofErr w:type="spellEnd"/>
-      <w:r>
-        <w:rPr>
-          <w:b/>
-          <w:bCs/>
-          <w:szCs w:val="20"/>
-        </w:rPr>
-        <w:t>&gt;&gt;</w:t>
-      </w:r>
-      <w:r>
-        <w:rPr>
-          <w:b/>
-          <w:bCs/>
-          <w:szCs w:val="20"/>
-        </w:rPr>
-        <w:tab/>
-      </w:r>
-    </w:p>
-    <w:p>
-      <w:pPr>
-        <w:tabs>
-          <w:tab w:val="right" w:pos="9360"/>
-        </w:tabs>
-        <w:rPr>
-          <w:szCs w:val="20"/>
-        </w:rPr>
-      </w:pPr>
-      <w:r>
-        <w:rPr>
-          <w:b/>
-          <w:bCs/>
-          <w:szCs w:val="20"/>
-        </w:rPr>
-        <w:t>&lt;&lt;</w:t>
-      </w:r>
-      <w:proofErr w:type="spellStart"/>
-      <w:r>
-        <w:rPr>
-          <w:b/>
-          <w:bCs/>
-          <w:szCs w:val="20"/>
-        </w:rPr>
-        <w:t>paraEmail</w:t>
-      </w:r>
-      <w:proofErr w:type="spellEnd"/>
-      <w:r>
-        <w:rPr>
-          <w:b/>
-          <w:bCs/>
-          <w:szCs w:val="20"/>
-        </w:rPr>
-        <w:t>&gt;&gt;</w:t>
-      </w:r>
-    </w:p>
-    <w:p>
-      <w:pPr>
-        <w:rPr>
-          <w:b/>
-          <w:bCs/>
-          <w:sz w:val="24"/>
-        </w:rPr>
-      </w:pPr>
-    </w:p>
-    <w:p>
-      <w:pPr>
-        <w:rPr>
-          <w:sz w:val="24"/>
-        </w:rPr>
-      </w:pPr>
-      <w:r>
-        <w:rPr>
-          <w:sz w:val="24"/>
-        </w:rPr>
-        <w:t>&lt;&lt;</w:t>
-      </w:r>
-      <w:proofErr w:type="spellStart"/>
-      <w:r>
-        <w:rPr>
-          <w:sz w:val="24"/>
-        </w:rPr>
-        <w:t>currentDate</w:t>
-      </w:r>
-      <w:proofErr w:type="spellEnd"/>
-      <w:r>
-        <w:rPr>
-          <w:sz w:val="24"/>
-        </w:rPr>
-        <w:t>&gt;&gt;</w:t>
-      </w:r>
-    </w:p>
-    <w:p>
-      <w:pPr>
-        <w:rPr>
-          <w:sz w:val="24"/>
-        </w:rPr>
-      </w:pPr>
-    </w:p>
-    <w:p>
-      <w:pPr>
-        <w:tabs>
-          <w:tab w:val="left" w:pos="-1440"/>
-        </w:tabs>
-        <w:rPr>
-          <w:sz w:val="24"/>
-        </w:rPr>
-      </w:pPr>
-      <w:r>
-        <w:rPr>
-          <w:sz w:val="24"/>
-        </w:rPr>
-        <w:t>&lt;&lt;recipient&gt;&gt;</w:t>
-      </w:r>
-    </w:p>
-    <w:p>
-      <w:pPr>
-        <w:tabs>
-          <w:tab w:val="left" w:pos="-1440"/>
-        </w:tabs>
-        <w:rPr>
-          <w:sz w:val="24"/>
-        </w:rPr>
-      </w:pPr>
-      <w:r>
-        <w:rPr>
-          <w:sz w:val="24"/>
-        </w:rPr>
-        <w:t>&lt;&lt;</w:t>
-      </w:r>
-      <w:proofErr w:type="spellStart"/>
-      <w:r>
-        <w:rPr>
-          <w:sz w:val="24"/>
-        </w:rPr>
-        <w:t>recipien</w:t>
-      </w:r>
-      <w:r>
-        <w:rPr>
-          <w:sz w:val="24"/>
-        </w:rPr>
-        <w:t>tTitle</w:t>
-      </w:r>
-      <w:proofErr w:type="spellEnd"/>
-      <w:r>
-        <w:rPr>
-          <w:sz w:val="24"/>
-        </w:rPr>
-        <w:t>&gt;&gt;</w:t>
-      </w:r>
-    </w:p>
-    <w:p>
-      <w:pPr>
-        <w:tabs>
-          <w:tab w:val="left" w:pos="-1440"/>
-        </w:tabs>
-        <w:rPr>
-          <w:sz w:val="24"/>
-        </w:rPr>
-      </w:pPr>
-      <w:r>
-        <w:rPr>
-          <w:sz w:val="24"/>
-        </w:rPr>
-        <w:t>&lt;&lt;</w:t>
-      </w:r>
-      <w:proofErr w:type="spellStart"/>
-      <w:r>
-        <w:rPr>
-          <w:sz w:val="24"/>
-        </w:rPr>
-        <w:t>orgName</w:t>
-      </w:r>
-      <w:proofErr w:type="spellEnd"/>
-      <w:r>
-        <w:rPr>
-          <w:sz w:val="24"/>
-        </w:rPr>
-        <w:t>&gt;&gt;</w:t>
-      </w:r>
-    </w:p>
-    <w:p>
-      <w:pPr>
-        <w:tabs>
-          <w:tab w:val="right" w:pos="9360"/>
-        </w:tabs>
-        <w:rPr>
-          <w:sz w:val="24"/>
-        </w:rPr>
-      </w:pPr>
-      <w:r>
-        <w:rPr>
-          <w:sz w:val="24"/>
-        </w:rPr>
-        <w:t>&lt;&lt;</w:t>
-      </w:r>
-      <w:proofErr w:type="spellStart"/>
-      <w:r>
-        <w:rPr>
-          <w:sz w:val="24"/>
-        </w:rPr>
-        <w:t>workAddr</w:t>
-      </w:r>
-      <w:proofErr w:type="spellEnd"/>
-      <w:r>
-        <w:rPr>
-          <w:sz w:val="24"/>
-        </w:rPr>
-        <w:t>&gt;&gt;</w:t>
+          <w:sz w:val="24"/>
+        </w:rPr>
+      </w:pPr>
+      <w:r>
+        <w:rPr>
+          <w:sz w:val="24"/>
+        </w:rPr>
+        <w:t>&lt;&lt;workAddr&gt;&gt;</w:t>
       </w:r>
     </w:p>
     <w:p>
@@ -459,21 +301,7 @@
         <w:rPr>
           <w:sz w:val="24"/>
         </w:rPr>
-        <w:t>&lt;&lt;</w:t>
-      </w:r>
-      <w:proofErr w:type="spellStart"/>
-      <w:r>
-        <w:rPr>
-          <w:sz w:val="24"/>
-        </w:rPr>
-        <w:t>orgName</w:t>
-      </w:r>
-      <w:proofErr w:type="spellEnd"/>
-      <w:r>
-        <w:rPr>
-          <w:sz w:val="24"/>
-        </w:rPr>
-        <w:t xml:space="preserve">&gt;&gt; </w:t>
+        <w:t xml:space="preserve">&lt;&lt;orgName&gt;&gt; </w:t>
       </w:r>
       <w:r>
         <w:rPr>
@@ -661,21 +489,7 @@
         <w:rPr>
           <w:sz w:val="24"/>
         </w:rPr>
-        <w:t>DEADLINE DATE:  &lt;&lt;</w:t>
-      </w:r>
-      <w:proofErr w:type="spellStart"/>
-      <w:r>
-        <w:rPr>
-          <w:sz w:val="24"/>
-        </w:rPr>
-        <w:t>DeadLineDate</w:t>
-      </w:r>
-      <w:proofErr w:type="spellEnd"/>
-      <w:r>
-        <w:rPr>
-          <w:sz w:val="24"/>
-        </w:rPr>
-        <w:t>&gt;&gt;</w:t>
+        <w:t>DEADLINE DATE:  &lt;&lt;DeadLineDate&gt;&gt;</w:t>
       </w:r>
       <w:r>
         <w:rPr>
@@ -733,21 +547,7 @@
         <w:rPr>
           <w:sz w:val="24"/>
         </w:rPr>
-        <w:t>&lt;&lt;</w:t>
-      </w:r>
-      <w:proofErr w:type="spellStart"/>
-      <w:r>
-        <w:rPr>
-          <w:sz w:val="24"/>
-        </w:rPr>
-        <w:t>partialSearch</w:t>
-      </w:r>
-      <w:proofErr w:type="spellEnd"/>
-      <w:r>
-        <w:rPr>
-          <w:sz w:val="24"/>
-        </w:rPr>
-        <w:t>&gt;&gt;</w:t>
+        <w:t>&lt;&lt;partialSearch&gt;&gt;</w:t>
       </w:r>
       <w:r>
         <w:rPr>
@@ -771,21 +571,7 @@
         <w:rPr>
           <w:sz w:val="24"/>
         </w:rPr>
-        <w:t>&lt;&lt;</w:t>
-      </w:r>
-      <w:proofErr w:type="spellStart"/>
-      <w:r>
-        <w:rPr>
-          <w:sz w:val="24"/>
-        </w:rPr>
-        <w:t>citedCopies</w:t>
-      </w:r>
-      <w:proofErr w:type="spellEnd"/>
-      <w:r>
-        <w:rPr>
-          <w:sz w:val="24"/>
-        </w:rPr>
-        <w:t>&gt;&gt;</w:t>
+        <w:t>&lt;&lt;citedCopies&gt;&gt;</w:t>
       </w:r>
       <w:r>
         <w:rPr>
@@ -833,115 +619,75 @@
         </w:rPr>
       </w:pPr>
     </w:p>
-    <w:tbl>
-      <w:tblPr>
-        <w:tblW w:w="7290" w:type="dxa"/>
-        <w:tblInd w:w="108" w:type="dxa"/>
-        <w:tblBorders>
-          <w:top w:val="single" w:sz="4" w:space="0" w:color="FFFFFF"/>
-          <w:left w:val="single" w:sz="4" w:space="0" w:color="FFFFFF"/>
-          <w:bottom w:val="single" w:sz="4" w:space="0" w:color="FFFFFF"/>
-          <w:right w:val="single" w:sz="4" w:space="0" w:color="FFFFFF"/>
-          <w:insideH w:val="single" w:sz="4" w:space="0" w:color="FFFFFF"/>
-          <w:insideV w:val="single" w:sz="4" w:space="0" w:color="FFFFFF"/>
-        </w:tblBorders>
-        <w:tblLook w:val="04A0" w:firstRow="1" w:lastRow="0" w:firstColumn="1" w:lastColumn="0" w:noHBand="0" w:noVBand="1"/>
-      </w:tblPr>
-      <w:tblGrid>
-        <w:gridCol w:w="1800"/>
-        <w:gridCol w:w="5490"/>
-      </w:tblGrid>
-      <w:tr>
-        <w:tc>
-          <w:tcPr>
-            <w:tcW w:w="1800" w:type="dxa"/>
-          </w:tcPr>
-          <w:p>
-            <w:pPr>
-              <w:rPr>
-                <w:sz w:val="24"/>
-              </w:rPr>
-            </w:pPr>
-            <w:r>
-              <w:rPr>
-                <w:sz w:val="24"/>
-              </w:rPr>
-              <w:t>Group</w:t>
-            </w:r>
-          </w:p>
-        </w:tc>
-        <w:tc>
-          <w:tcPr>
-            <w:tcW w:w="5490" w:type="dxa"/>
-          </w:tcPr>
-          <w:p>
-            <w:pPr>
-              <w:rPr>
-                <w:sz w:val="24"/>
-              </w:rPr>
-            </w:pPr>
-            <w:r>
-              <w:rPr>
-                <w:sz w:val="24"/>
-              </w:rPr>
-              <w:t>Claim(s)</w:t>
-            </w:r>
-          </w:p>
-        </w:tc>
-      </w:tr>
-      <w:tr>
-        <w:tc>
-          <w:tcPr>
-            <w:tcW w:w="1800" w:type="dxa"/>
-          </w:tcPr>
-          <w:p>
-            <w:pPr>
-              <w:rPr>
-                <w:sz w:val="24"/>
-              </w:rPr>
-            </w:pPr>
-            <w:r>
-              <w:rPr>
-                <w:sz w:val="24"/>
-              </w:rPr>
-              <w:t>&lt;&lt;</w:t>
-            </w:r>
-            <w:proofErr w:type="spellStart"/>
-            <w:r>
-              <w:rPr>
-                <w:sz w:val="24"/>
-              </w:rPr>
-              <w:t>groupNbr</w:t>
-            </w:r>
-            <w:proofErr w:type="spellEnd"/>
-            <w:r>
-              <w:rPr>
-                <w:sz w:val="24"/>
-              </w:rPr>
-              <w:t>&gt;&gt;</w:t>
-            </w:r>
-          </w:p>
-        </w:tc>
-        <w:tc>
-          <w:tcPr>
-            <w:tcW w:w="5490" w:type="dxa"/>
-          </w:tcPr>
-          <w:p>
-            <w:pPr>
-              <w:rPr>
-                <w:sz w:val="24"/>
-              </w:rPr>
-            </w:pPr>
-            <w:r>
-              <w:rPr>
-                <w:sz w:val="24"/>
-              </w:rPr>
-              <w:t>&lt;&lt;claims&gt;&gt;</w:t>
-            </w:r>
-          </w:p>
-        </w:tc>
-      </w:tr>
-    </w:tbl>
+    <w:p>
+      <w:pPr>
+        <w:rPr>
+          <w:sz w:val="24"/>
+        </w:rPr>
+      </w:pPr>
+      <w:r>
+        <w:rPr>
+          <w:sz w:val="24"/>
+        </w:rPr>
+        <w:t xml:space="preserve">  Group</w:t>
+      </w:r>
+      <w:r>
+        <w:rPr>
+          <w:sz w:val="24"/>
+        </w:rPr>
+        <w:tab/>
+        <w:t xml:space="preserve">        </w:t>
+      </w:r>
+      <w:r>
+        <w:rPr>
+          <w:sz w:val="24"/>
+        </w:rPr>
+        <w:tab/>
+      </w:r>
+      <w:r>
+        <w:rPr>
+          <w:sz w:val="24"/>
+        </w:rPr>
+        <w:tab/>
+      </w:r>
+      <w:r>
+        <w:rPr>
+          <w:sz w:val="24"/>
+        </w:rPr>
+        <w:t>Claim(s)</w:t>
+      </w:r>
+    </w:p>
+    <w:p>
+      <w:pPr>
+        <w:rPr>
+          <w:sz w:val="24"/>
+        </w:rPr>
+      </w:pPr>
+      <w:r>
+        <w:rPr>
+          <w:sz w:val="24"/>
+        </w:rPr>
+        <w:t xml:space="preserve">  &lt;&lt;groupNbr&gt;&gt;      </w:t>
+      </w:r>
+      <w:r>
+        <w:rPr>
+          <w:sz w:val="24"/>
+        </w:rPr>
+        <w:tab/>
+      </w:r>
+      <w:r>
+        <w:rPr>
+          <w:sz w:val="24"/>
+        </w:rPr>
+        <w:tab/>
+      </w:r>
+      <w:r>
+        <w:rPr>
+          <w:sz w:val="24"/>
+        </w:rPr>
+        <w:t>&lt;&lt;claims&gt;&gt;</w:t>
+      </w:r>
+    </w:p>
     <w:p>
       <w:pPr>
         <w:rPr>
@@ -965,21 +711,7 @@
         <w:rPr>
           <w:sz w:val="24"/>
         </w:rPr>
-        <w:t>&lt;&lt;</w:t>
-      </w:r>
-      <w:proofErr w:type="spellStart"/>
-      <w:r>
-        <w:rPr>
-          <w:sz w:val="24"/>
-        </w:rPr>
-        <w:t>npdueDate</w:t>
-      </w:r>
-      <w:proofErr w:type="spellEnd"/>
-      <w:r>
-        <w:rPr>
-          <w:sz w:val="24"/>
-        </w:rPr>
-        <w:t>&gt;&gt;</w:t>
+        <w:t>&lt;&lt;npdueDate&gt;&gt;</w:t>
       </w:r>
       <w:r>
         <w:rPr>
@@ -1018,21 +750,7 @@
         <w:rPr>
           <w:sz w:val="24"/>
         </w:rPr>
-        <w:t>&lt;&lt;</w:t>
-      </w:r>
-      <w:proofErr w:type="spellStart"/>
-      <w:r>
-        <w:rPr>
-          <w:sz w:val="24"/>
-        </w:rPr>
-        <w:t>claimAmt</w:t>
-      </w:r>
-      <w:proofErr w:type="spellEnd"/>
-      <w:r>
-        <w:rPr>
-          <w:sz w:val="24"/>
-        </w:rPr>
-        <w:t>&gt;&gt;</w:t>
+        <w:t>&lt;&lt;claimAmt&gt;&gt;</w:t>
       </w:r>
       <w:r>
         <w:rPr>
@@ -1123,21 +841,7 @@
         <w:rPr>
           <w:sz w:val="24"/>
         </w:rPr>
-        <w:t>&lt;&lt;</w:t>
-      </w:r>
-      <w:proofErr w:type="spellStart"/>
-      <w:r>
-        <w:rPr>
-          <w:sz w:val="24"/>
-        </w:rPr>
-        <w:t>WAName</w:t>
-      </w:r>
-      <w:proofErr w:type="spellEnd"/>
-      <w:r>
-        <w:rPr>
-          <w:sz w:val="24"/>
-        </w:rPr>
-        <w:t>&gt;&gt;</w:t>
+        <w:t>&lt;&lt;WAName&gt;&gt;</w:t>
       </w:r>
       <w:r>
         <w:rPr>
@@ -1149,21 +853,7 @@
         <w:rPr>
           <w:sz w:val="24"/>
         </w:rPr>
-        <w:t>&lt;&lt;</w:t>
-      </w:r>
-      <w:proofErr w:type="spellStart"/>
-      <w:r>
-        <w:rPr>
-          <w:sz w:val="24"/>
-        </w:rPr>
-        <w:t>WAPhone</w:t>
-      </w:r>
-      <w:proofErr w:type="spellEnd"/>
-      <w:r>
-        <w:rPr>
-          <w:sz w:val="24"/>
-        </w:rPr>
-        <w:t>&gt;&gt;</w:t>
+        <w:t>&lt;&lt;WAPhone&gt;&gt;</w:t>
       </w:r>
       <w:r>
         <w:rPr>
@@ -1175,21 +865,7 @@
         <w:rPr>
           <w:sz w:val="24"/>
         </w:rPr>
-        <w:t>&lt;&lt;</w:t>
-      </w:r>
-      <w:proofErr w:type="spellStart"/>
-      <w:r>
-        <w:rPr>
-          <w:sz w:val="24"/>
-        </w:rPr>
-        <w:t>paraName</w:t>
-      </w:r>
-      <w:proofErr w:type="spellEnd"/>
-      <w:r>
-        <w:rPr>
-          <w:sz w:val="24"/>
-        </w:rPr>
-        <w:t>&gt;&gt;</w:t>
+        <w:t>&lt;&lt;paraName&gt;&gt;</w:t>
       </w:r>
       <w:r>
         <w:rPr>
@@ -1201,21 +877,7 @@
         <w:rPr>
           <w:sz w:val="24"/>
         </w:rPr>
-        <w:t>&lt;&lt;</w:t>
-      </w:r>
-      <w:proofErr w:type="spellStart"/>
-      <w:r>
-        <w:rPr>
-          <w:sz w:val="24"/>
-        </w:rPr>
-        <w:t>paraPhone</w:t>
-      </w:r>
-      <w:proofErr w:type="spellEnd"/>
-      <w:r>
-        <w:rPr>
-          <w:sz w:val="24"/>
-        </w:rPr>
-        <w:t>&gt;&gt;</w:t>
+        <w:t>&lt;&lt;paraPhone&gt;&gt;</w:t>
       </w:r>
       <w:r>
         <w:rPr>
@@ -1269,23 +931,7 @@
           <w:color w:val="000000"/>
           <w:sz w:val="24"/>
         </w:rPr>
-        <w:t>&lt;&lt;</w:t>
-      </w:r>
-      <w:proofErr w:type="spellStart"/>
-      <w:r>
-        <w:rPr>
-          <w:color w:val="000000"/>
-          <w:sz w:val="24"/>
-        </w:rPr>
-        <w:t>cmgName</w:t>
-      </w:r>
-      <w:proofErr w:type="spellEnd"/>
-      <w:r>
-        <w:rPr>
-          <w:color w:val="000000"/>
-          <w:sz w:val="24"/>
-        </w:rPr>
-        <w:t>&gt;&gt;</w:t>
+        <w:t>&lt;&lt;cmgName&gt;&gt;</w:t>
       </w:r>
     </w:p>
     <w:p>
@@ -1345,15 +991,7 @@
           </w:tcPr>
           <w:p>
             <w:r>
-              <w:t>&lt;&lt;</w:t>
-            </w:r>
-            <w:proofErr w:type="spellStart"/>
-            <w:r>
-              <w:t>ccTag</w:t>
-            </w:r>
-            <w:proofErr w:type="spellEnd"/>
-            <w:r>
-              <w:t>&gt;&gt;</w:t>
+              <w:t>&lt;&lt;ccTag&gt;&gt;</w:t>
             </w:r>
           </w:p>
         </w:tc>
@@ -1363,15 +1001,7 @@
           </w:tcPr>
           <w:p>
             <w:r>
-              <w:t>&lt;&lt;</w:t>
-            </w:r>
-            <w:proofErr w:type="spellStart"/>
-            <w:r>
-              <w:t>ccName</w:t>
-            </w:r>
-            <w:proofErr w:type="spellEnd"/>
-            <w:r>
-              <w:t>&gt;&gt;</w:t>
+              <w:t>&lt;&lt;ccName&gt;&gt;</w:t>
             </w:r>
           </w:p>
         </w:tc>
@@ -1534,6 +1164,50 @@
     <w:lsdException w:name="Subtitle" w:qFormat="1"/>
     <w:lsdException w:name="Strong" w:qFormat="1"/>
     <w:lsdException w:name="Emphasis" w:qFormat="1"/>
+    <w:lsdException w:name="Normal Table" w:semiHidden="1" w:unhideWhenUsed="1"/>
+    <w:lsdException w:name="Table Simple 1" w:semiHidden="1" w:unhideWhenUsed="1"/>
+    <w:lsdException w:name="Table Simple 2" w:semiHidden="1" w:unhideWhenUsed="1"/>
+    <w:lsdException w:name="Table Simple 3" w:semiHidden="1" w:unhideWhenUsed="1"/>
+    <w:lsdException w:name="Table Classic 1" w:semiHidden="1" w:unhideWhenUsed="1"/>
+    <w:lsdException w:name="Table Classic 2" w:semiHidden="1" w:unhideWhenUsed="1"/>
+    <w:lsdException w:name="Table Classic 3" w:semiHidden="1" w:unhideWhenUsed="1"/>
+    <w:lsdException w:name="Table Classic 4" w:semiHidden="1" w:unhideWhenUsed="1"/>
+    <w:lsdException w:name="Table Colorful 1" w:semiHidden="1" w:unhideWhenUsed="1"/>
+    <w:lsdException w:name="Table Colorful 2" w:semiHidden="1" w:unhideWhenUsed="1"/>
+    <w:lsdException w:name="Table Colorful 3" w:semiHidden="1" w:unhideWhenUsed="1"/>
+    <w:lsdException w:name="Table Columns 1" w:semiHidden="1" w:unhideWhenUsed="1"/>
+    <w:lsdException w:name="Table Columns 2" w:semiHidden="1" w:unhideWhenUsed="1"/>
+    <w:lsdException w:name="Table Columns 3" w:semiHidden="1" w:unhideWhenUsed="1"/>
+    <w:lsdException w:name="Table Columns 4" w:semiHidden="1" w:unhideWhenUsed="1"/>
+    <w:lsdException w:name="Table Columns 5" w:semiHidden="1" w:unhideWhenUsed="1"/>
+    <w:lsdException w:name="Table Grid 1" w:semiHidden="1" w:unhideWhenUsed="1"/>
+    <w:lsdException w:name="Table Grid 2" w:semiHidden="1" w:unhideWhenUsed="1"/>
+    <w:lsdException w:name="Table Grid 3" w:semiHidden="1" w:unhideWhenUsed="1"/>
+    <w:lsdException w:name="Table Grid 4" w:semiHidden="1" w:unhideWhenUsed="1"/>
+    <w:lsdException w:name="Table Grid 5" w:semiHidden="1" w:unhideWhenUsed="1"/>
+    <w:lsdException w:name="Table Grid 6" w:semiHidden="1" w:unhideWhenUsed="1"/>
+    <w:lsdException w:name="Table Grid 7" w:semiHidden="1" w:unhideWhenUsed="1"/>
+    <w:lsdException w:name="Table Grid 8" w:semiHidden="1" w:unhideWhenUsed="1"/>
+    <w:lsdException w:name="Table List 1" w:semiHidden="1" w:unhideWhenUsed="1"/>
+    <w:lsdException w:name="Table List 2" w:semiHidden="1" w:unhideWhenUsed="1"/>
+    <w:lsdException w:name="Table List 3" w:semiHidden="1" w:unhideWhenUsed="1"/>
+    <w:lsdException w:name="Table List 4" w:semiHidden="1" w:unhideWhenUsed="1"/>
+    <w:lsdException w:name="Table List 5" w:semiHidden="1" w:unhideWhenUsed="1"/>
+    <w:lsdException w:name="Table List 6" w:semiHidden="1" w:unhideWhenUsed="1"/>
+    <w:lsdException w:name="Table List 7" w:semiHidden="1" w:unhideWhenUsed="1"/>
+    <w:lsdException w:name="Table List 8" w:semiHidden="1" w:unhideWhenUsed="1"/>
+    <w:lsdException w:name="Table 3D effects 1" w:semiHidden="1" w:unhideWhenUsed="1"/>
+    <w:lsdException w:name="Table 3D effects 2" w:semiHidden="1" w:unhideWhenUsed="1"/>
+    <w:lsdException w:name="Table 3D effects 3" w:semiHidden="1" w:unhideWhenUsed="1"/>
+    <w:lsdException w:name="Table Contemporary" w:semiHidden="1" w:unhideWhenUsed="1"/>
+    <w:lsdException w:name="Table Elegant" w:semiHidden="1" w:unhideWhenUsed="1"/>
+    <w:lsdException w:name="Table Professional" w:semiHidden="1" w:unhideWhenUsed="1"/>
+    <w:lsdException w:name="Table Subtle 1" w:semiHidden="1" w:unhideWhenUsed="1"/>
+    <w:lsdException w:name="Table Subtle 2" w:semiHidden="1" w:unhideWhenUsed="1"/>
+    <w:lsdException w:name="Table Web 1" w:semiHidden="1" w:unhideWhenUsed="1"/>
+    <w:lsdException w:name="Table Web 2" w:semiHidden="1" w:unhideWhenUsed="1"/>
+    <w:lsdException w:name="Table Web 3" w:semiHidden="1" w:unhideWhenUsed="1"/>
+    <w:lsdException w:name="Table Theme" w:semiHidden="1" w:unhideWhenUsed="1"/>
     <w:lsdException w:name="Placeholder Text" w:semiHidden="1" w:uiPriority="99"/>
     <w:lsdException w:name="No Spacing" w:uiPriority="1" w:qFormat="1"/>
     <w:lsdException w:name="Light Shading" w:uiPriority="60"/>
@@ -1771,11 +1445,15 @@
   </w:style>
   <w:style w:type="character" w:default="1" w:styleId="DefaultParagraphFont">
     <w:name w:val="Default Paragraph Font"/>
+    <w:uiPriority w:val="1"/>
     <w:semiHidden/>
+    <w:unhideWhenUsed/>
   </w:style>
   <w:style w:type="table" w:default="1" w:styleId="TableNormal">
     <w:name w:val="Normal Table"/>
+    <w:uiPriority w:val="99"/>
     <w:semiHidden/>
+    <w:unhideWhenUsed/>
     <w:tblPr>
       <w:tblInd w:w="0" w:type="dxa"/>
       <w:tblCellMar>
@@ -1788,7 +1466,9 @@
   </w:style>
   <w:style w:type="numbering" w:default="1" w:styleId="NoList">
     <w:name w:val="No List"/>
+    <w:uiPriority w:val="99"/>
     <w:semiHidden/>
+    <w:unhideWhenUsed/>
   </w:style>
   <w:style w:type="character" w:styleId="FootnoteReference">
     <w:name w:val="footnote reference"/>

</xml_diff>